<commit_message>
docs(student): nop bao cao file word
</commit_message>
<xml_diff>
--- a/ProgressTest/student-thymeleaf/HSF302_ProgressTest_DE200093.docx
+++ b/ProgressTest/student-thymeleaf/HSF302_ProgressTest_DE200093.docx
@@ -9,8 +9,40 @@
         <w:rPr>
           <w:rFonts w:ascii="Times New Roman" w:hAnsi="Times New Roman" w:cs="Times New Roman"/>
           <w:color w:val="000000" w:themeColor="text1"/>
+          <w:sz w:val="36"/>
+          <w:szCs w:val="36"/>
         </w:rPr>
       </w:pPr>
+      <w:proofErr w:type="spellStart"/>
+      <w:r>
+        <w:rPr>
+          <w:rFonts w:ascii="Times New Roman" w:hAnsi="Times New Roman" w:cs="Times New Roman"/>
+          <w:color w:val="000000" w:themeColor="text1"/>
+          <w:sz w:val="36"/>
+          <w:szCs w:val="36"/>
+        </w:rPr>
+        <w:t>ProgressTest</w:t>
+      </w:r>
+      <w:proofErr w:type="spellEnd"/>
+      <w:r>
+        <w:rPr>
+          <w:rFonts w:ascii="Times New Roman" w:hAnsi="Times New Roman" w:cs="Times New Roman"/>
+          <w:color w:val="000000" w:themeColor="text1"/>
+          <w:sz w:val="36"/>
+          <w:szCs w:val="36"/>
+        </w:rPr>
+        <w:t xml:space="preserve"> 1</w:t>
+      </w:r>
+    </w:p>
+    <w:p>
+      <w:pPr>
+        <w:spacing w:after="0"/>
+        <w:jc w:val="center"/>
+        <w:rPr>
+          <w:rFonts w:ascii="Times New Roman" w:hAnsi="Times New Roman" w:cs="Times New Roman"/>
+          <w:color w:val="000000" w:themeColor="text1"/>
+        </w:rPr>
+      </w:pPr>
       <w:r>
         <w:rPr>
           <w:rFonts w:ascii="Times New Roman" w:hAnsi="Times New Roman" w:cs="Times New Roman"/>
@@ -18,17 +50,72 @@
         </w:rPr>
         <w:br/>
       </w:r>
-      <w:r>
-        <w:rPr>
-          <w:rFonts w:ascii="Times New Roman" w:hAnsi="Times New Roman" w:cs="Times New Roman"/>
-          <w:color w:val="000000" w:themeColor="text1"/>
-        </w:rPr>
-        <w:t>Họ và Tên:</w:t>
-      </w:r>
-      <w:r>
-        <w:rPr>
-          <w:rFonts w:ascii="Times New Roman" w:hAnsi="Times New Roman" w:cs="Times New Roman"/>
-          <w:color w:val="000000" w:themeColor="text1"/>
+      <w:proofErr w:type="spellStart"/>
+      <w:r>
+        <w:rPr>
+          <w:rFonts w:ascii="Times New Roman" w:hAnsi="Times New Roman" w:cs="Times New Roman"/>
+          <w:color w:val="000000" w:themeColor="text1"/>
+          <w:sz w:val="32"/>
+          <w:szCs w:val="32"/>
+        </w:rPr>
+        <w:t>Họ</w:t>
+      </w:r>
+      <w:proofErr w:type="spellEnd"/>
+      <w:r>
+        <w:rPr>
+          <w:rFonts w:ascii="Times New Roman" w:hAnsi="Times New Roman" w:cs="Times New Roman"/>
+          <w:color w:val="000000" w:themeColor="text1"/>
+          <w:sz w:val="32"/>
+          <w:szCs w:val="32"/>
+        </w:rPr>
+        <w:t xml:space="preserve"> </w:t>
+      </w:r>
+      <w:proofErr w:type="spellStart"/>
+      <w:r>
+        <w:rPr>
+          <w:rFonts w:ascii="Times New Roman" w:hAnsi="Times New Roman" w:cs="Times New Roman"/>
+          <w:color w:val="000000" w:themeColor="text1"/>
+          <w:sz w:val="32"/>
+          <w:szCs w:val="32"/>
+        </w:rPr>
+        <w:t>và</w:t>
+      </w:r>
+      <w:proofErr w:type="spellEnd"/>
+      <w:r>
+        <w:rPr>
+          <w:rFonts w:ascii="Times New Roman" w:hAnsi="Times New Roman" w:cs="Times New Roman"/>
+          <w:color w:val="000000" w:themeColor="text1"/>
+          <w:sz w:val="32"/>
+          <w:szCs w:val="32"/>
+        </w:rPr>
+        <w:t xml:space="preserve"> </w:t>
+      </w:r>
+      <w:proofErr w:type="spellStart"/>
+      <w:r>
+        <w:rPr>
+          <w:rFonts w:ascii="Times New Roman" w:hAnsi="Times New Roman" w:cs="Times New Roman"/>
+          <w:color w:val="000000" w:themeColor="text1"/>
+          <w:sz w:val="32"/>
+          <w:szCs w:val="32"/>
+        </w:rPr>
+        <w:t>Tên</w:t>
+      </w:r>
+      <w:proofErr w:type="spellEnd"/>
+      <w:r>
+        <w:rPr>
+          <w:rFonts w:ascii="Times New Roman" w:hAnsi="Times New Roman" w:cs="Times New Roman"/>
+          <w:color w:val="000000" w:themeColor="text1"/>
+          <w:sz w:val="32"/>
+          <w:szCs w:val="32"/>
+        </w:rPr>
+        <w:t>:</w:t>
+      </w:r>
+      <w:r>
+        <w:rPr>
+          <w:rFonts w:ascii="Times New Roman" w:hAnsi="Times New Roman" w:cs="Times New Roman"/>
+          <w:color w:val="000000" w:themeColor="text1"/>
+          <w:sz w:val="32"/>
+          <w:szCs w:val="32"/>
         </w:rPr>
         <w:t xml:space="preserve"> H</w:t>
       </w:r>
@@ -36,6 +123,8 @@
         <w:rPr>
           <w:rFonts w:ascii="Times New Roman" w:hAnsi="Times New Roman" w:cs="Times New Roman"/>
           <w:color w:val="000000" w:themeColor="text1"/>
+          <w:sz w:val="32"/>
+          <w:szCs w:val="32"/>
         </w:rPr>
         <w:t>ồ</w:t>
       </w:r>
@@ -43,6 +132,8 @@
         <w:rPr>
           <w:rFonts w:ascii="Times New Roman" w:hAnsi="Times New Roman" w:cs="Times New Roman"/>
           <w:color w:val="000000" w:themeColor="text1"/>
+          <w:sz w:val="32"/>
+          <w:szCs w:val="32"/>
         </w:rPr>
         <w:t xml:space="preserve"> Bình Nguyên </w:t>
       </w:r>
@@ -50,6 +141,8 @@
         <w:rPr>
           <w:rFonts w:ascii="Times New Roman" w:hAnsi="Times New Roman" w:cs="Times New Roman"/>
           <w:color w:val="000000" w:themeColor="text1"/>
+          <w:sz w:val="32"/>
+          <w:szCs w:val="32"/>
         </w:rPr>
         <w:t xml:space="preserve">- </w:t>
       </w:r>
@@ -57,6 +150,8 @@
         <w:rPr>
           <w:rFonts w:ascii="Times New Roman" w:hAnsi="Times New Roman" w:cs="Times New Roman"/>
           <w:color w:val="000000" w:themeColor="text1"/>
+          <w:sz w:val="32"/>
+          <w:szCs w:val="32"/>
         </w:rPr>
         <w:t>DE200093</w:t>
       </w:r>
@@ -117,11 +212,33 @@
               <w:rFonts w:ascii="Times New Roman" w:hAnsi="Times New Roman" w:cs="Times New Roman"/>
             </w:rPr>
           </w:pPr>
+          <w:proofErr w:type="spellStart"/>
           <w:r>
             <w:rPr>
               <w:rFonts w:ascii="Times New Roman" w:hAnsi="Times New Roman" w:cs="Times New Roman"/>
             </w:rPr>
-            <w:t xml:space="preserve">Mục lục: </w:t>
+            <w:t>Mục</w:t>
+          </w:r>
+          <w:proofErr w:type="spellEnd"/>
+          <w:r>
+            <w:rPr>
+              <w:rFonts w:ascii="Times New Roman" w:hAnsi="Times New Roman" w:cs="Times New Roman"/>
+            </w:rPr>
+            <w:t xml:space="preserve"> </w:t>
+          </w:r>
+          <w:proofErr w:type="spellStart"/>
+          <w:r>
+            <w:rPr>
+              <w:rFonts w:ascii="Times New Roman" w:hAnsi="Times New Roman" w:cs="Times New Roman"/>
+            </w:rPr>
+            <w:t>lục</w:t>
+          </w:r>
+          <w:proofErr w:type="spellEnd"/>
+          <w:r>
+            <w:rPr>
+              <w:rFonts w:ascii="Times New Roman" w:hAnsi="Times New Roman" w:cs="Times New Roman"/>
+            </w:rPr>
+            <w:t xml:space="preserve">: </w:t>
           </w:r>
         </w:p>
         <w:p>
@@ -3066,7 +3183,87 @@
           <w:sz w:val="26"/>
           <w:szCs w:val="26"/>
         </w:rPr>
-        <w:t>i trùng mã sinh viên.</w:t>
+        <w:t xml:space="preserve">i </w:t>
+      </w:r>
+      <w:proofErr w:type="spellStart"/>
+      <w:r>
+        <w:rPr>
+          <w:rFonts w:ascii="Times New Roman" w:hAnsi="Times New Roman" w:cs="Times New Roman"/>
+          <w:color w:val="000000" w:themeColor="text1"/>
+          <w:sz w:val="26"/>
+          <w:szCs w:val="26"/>
+        </w:rPr>
+        <w:t>trùng</w:t>
+      </w:r>
+      <w:proofErr w:type="spellEnd"/>
+      <w:r>
+        <w:rPr>
+          <w:rFonts w:ascii="Times New Roman" w:hAnsi="Times New Roman" w:cs="Times New Roman"/>
+          <w:color w:val="000000" w:themeColor="text1"/>
+          <w:sz w:val="26"/>
+          <w:szCs w:val="26"/>
+        </w:rPr>
+        <w:t xml:space="preserve"> </w:t>
+      </w:r>
+      <w:proofErr w:type="spellStart"/>
+      <w:r>
+        <w:rPr>
+          <w:rFonts w:ascii="Times New Roman" w:hAnsi="Times New Roman" w:cs="Times New Roman"/>
+          <w:color w:val="000000" w:themeColor="text1"/>
+          <w:sz w:val="26"/>
+          <w:szCs w:val="26"/>
+        </w:rPr>
+        <w:t>mã</w:t>
+      </w:r>
+      <w:proofErr w:type="spellEnd"/>
+      <w:r>
+        <w:rPr>
+          <w:rFonts w:ascii="Times New Roman" w:hAnsi="Times New Roman" w:cs="Times New Roman"/>
+          <w:color w:val="000000" w:themeColor="text1"/>
+          <w:sz w:val="26"/>
+          <w:szCs w:val="26"/>
+        </w:rPr>
+        <w:t xml:space="preserve"> </w:t>
+      </w:r>
+      <w:proofErr w:type="spellStart"/>
+      <w:r>
+        <w:rPr>
+          <w:rFonts w:ascii="Times New Roman" w:hAnsi="Times New Roman" w:cs="Times New Roman"/>
+          <w:color w:val="000000" w:themeColor="text1"/>
+          <w:sz w:val="26"/>
+          <w:szCs w:val="26"/>
+        </w:rPr>
+        <w:t>sinh</w:t>
+      </w:r>
+      <w:proofErr w:type="spellEnd"/>
+      <w:r>
+        <w:rPr>
+          <w:rFonts w:ascii="Times New Roman" w:hAnsi="Times New Roman" w:cs="Times New Roman"/>
+          <w:color w:val="000000" w:themeColor="text1"/>
+          <w:sz w:val="26"/>
+          <w:szCs w:val="26"/>
+        </w:rPr>
+        <w:t xml:space="preserve"> </w:t>
+      </w:r>
+      <w:proofErr w:type="spellStart"/>
+      <w:r>
+        <w:rPr>
+          <w:rFonts w:ascii="Times New Roman" w:hAnsi="Times New Roman" w:cs="Times New Roman"/>
+          <w:color w:val="000000" w:themeColor="text1"/>
+          <w:sz w:val="26"/>
+          <w:szCs w:val="26"/>
+        </w:rPr>
+        <w:t>viên</w:t>
+      </w:r>
+      <w:proofErr w:type="spellEnd"/>
+      <w:r>
+        <w:rPr>
+          <w:rFonts w:ascii="Times New Roman" w:hAnsi="Times New Roman" w:cs="Times New Roman"/>
+          <w:color w:val="000000" w:themeColor="text1"/>
+          <w:sz w:val="26"/>
+          <w:szCs w:val="26"/>
+        </w:rPr>
+        <w:t>.</w:t>
       </w:r>
     </w:p>
     <w:p>
@@ -3250,6 +3447,7 @@
           <w:szCs w:val="26"/>
         </w:rPr>
       </w:pPr>
+      <w:proofErr w:type="spellStart"/>
       <w:r>
         <w:rPr>
           <w:rFonts w:ascii="Times New Roman" w:hAnsi="Times New Roman" w:cs="Times New Roman"/>
@@ -3257,8 +3455,69 @@
           <w:sz w:val="26"/>
           <w:szCs w:val="26"/>
         </w:rPr>
-        <w:t>Thêm mới thành công</w:t>
-      </w:r>
+        <w:t>Thêm</w:t>
+      </w:r>
+      <w:proofErr w:type="spellEnd"/>
+      <w:r>
+        <w:rPr>
+          <w:rFonts w:ascii="Times New Roman" w:hAnsi="Times New Roman" w:cs="Times New Roman"/>
+          <w:color w:val="000000" w:themeColor="text1"/>
+          <w:sz w:val="26"/>
+          <w:szCs w:val="26"/>
+        </w:rPr>
+        <w:t xml:space="preserve"> </w:t>
+      </w:r>
+      <w:proofErr w:type="spellStart"/>
+      <w:r>
+        <w:rPr>
+          <w:rFonts w:ascii="Times New Roman" w:hAnsi="Times New Roman" w:cs="Times New Roman"/>
+          <w:color w:val="000000" w:themeColor="text1"/>
+          <w:sz w:val="26"/>
+          <w:szCs w:val="26"/>
+        </w:rPr>
+        <w:t>mới</w:t>
+      </w:r>
+      <w:proofErr w:type="spellEnd"/>
+      <w:r>
+        <w:rPr>
+          <w:rFonts w:ascii="Times New Roman" w:hAnsi="Times New Roman" w:cs="Times New Roman"/>
+          <w:color w:val="000000" w:themeColor="text1"/>
+          <w:sz w:val="26"/>
+          <w:szCs w:val="26"/>
+        </w:rPr>
+        <w:t xml:space="preserve"> </w:t>
+      </w:r>
+      <w:proofErr w:type="spellStart"/>
+      <w:r>
+        <w:rPr>
+          <w:rFonts w:ascii="Times New Roman" w:hAnsi="Times New Roman" w:cs="Times New Roman"/>
+          <w:color w:val="000000" w:themeColor="text1"/>
+          <w:sz w:val="26"/>
+          <w:szCs w:val="26"/>
+        </w:rPr>
+        <w:t>thành</w:t>
+      </w:r>
+      <w:proofErr w:type="spellEnd"/>
+      <w:r>
+        <w:rPr>
+          <w:rFonts w:ascii="Times New Roman" w:hAnsi="Times New Roman" w:cs="Times New Roman"/>
+          <w:color w:val="000000" w:themeColor="text1"/>
+          <w:sz w:val="26"/>
+          <w:szCs w:val="26"/>
+        </w:rPr>
+        <w:t xml:space="preserve"> </w:t>
+      </w:r>
+      <w:proofErr w:type="spellStart"/>
+      <w:r>
+        <w:rPr>
+          <w:rFonts w:ascii="Times New Roman" w:hAnsi="Times New Roman" w:cs="Times New Roman"/>
+          <w:color w:val="000000" w:themeColor="text1"/>
+          <w:sz w:val="26"/>
+          <w:szCs w:val="26"/>
+        </w:rPr>
+        <w:t>công</w:t>
+      </w:r>
+      <w:proofErr w:type="spellEnd"/>
     </w:p>
     <w:p>
       <w:pPr>
@@ -3596,8 +3855,9 @@
           <w:sz w:val="26"/>
           <w:szCs w:val="26"/>
         </w:rPr>
-        <w:t>c (GPA &lt; 5 màu đ</w:t>
-      </w:r>
+        <w:t xml:space="preserve">c (GPA &lt; 5 </w:t>
+      </w:r>
+      <w:proofErr w:type="spellStart"/>
       <w:r>
         <w:rPr>
           <w:rFonts w:ascii="Times New Roman" w:hAnsi="Times New Roman" w:cs="Times New Roman"/>
@@ -3605,8 +3865,38 @@
           <w:sz w:val="26"/>
           <w:szCs w:val="26"/>
         </w:rPr>
+        <w:t>màu</w:t>
+      </w:r>
+      <w:proofErr w:type="spellEnd"/>
+      <w:r>
+        <w:rPr>
+          <w:rFonts w:ascii="Times New Roman" w:hAnsi="Times New Roman" w:cs="Times New Roman"/>
+          <w:color w:val="000000" w:themeColor="text1"/>
+          <w:sz w:val="26"/>
+          <w:szCs w:val="26"/>
+        </w:rPr>
+        <w:t xml:space="preserve"> </w:t>
+      </w:r>
+      <w:proofErr w:type="spellStart"/>
+      <w:r>
+        <w:rPr>
+          <w:rFonts w:ascii="Times New Roman" w:hAnsi="Times New Roman" w:cs="Times New Roman"/>
+          <w:color w:val="000000" w:themeColor="text1"/>
+          <w:sz w:val="26"/>
+          <w:szCs w:val="26"/>
+        </w:rPr>
+        <w:t>đ</w:t>
+      </w:r>
+      <w:r>
+        <w:rPr>
+          <w:rFonts w:ascii="Times New Roman" w:hAnsi="Times New Roman" w:cs="Times New Roman"/>
+          <w:color w:val="000000" w:themeColor="text1"/>
+          <w:sz w:val="26"/>
+          <w:szCs w:val="26"/>
+        </w:rPr>
         <w:t>ỏ</w:t>
       </w:r>
+      <w:proofErr w:type="spellEnd"/>
       <w:r>
         <w:rPr>
           <w:rFonts w:ascii="Times New Roman" w:hAnsi="Times New Roman" w:cs="Times New Roman"/>
@@ -3687,6 +3977,7 @@
           <w:szCs w:val="26"/>
         </w:rPr>
       </w:pPr>
+      <w:proofErr w:type="spellStart"/>
       <w:r>
         <w:rPr>
           <w:rFonts w:ascii="Times New Roman" w:hAnsi="Times New Roman" w:cs="Times New Roman"/>
@@ -3694,7 +3985,97 @@
           <w:sz w:val="26"/>
           <w:szCs w:val="26"/>
         </w:rPr>
-        <w:t>Tìm kiếm sinh viên họ Nguyễn</w:t>
+        <w:t>Tìm</w:t>
+      </w:r>
+      <w:proofErr w:type="spellEnd"/>
+      <w:r>
+        <w:rPr>
+          <w:rFonts w:ascii="Times New Roman" w:hAnsi="Times New Roman" w:cs="Times New Roman"/>
+          <w:color w:val="000000" w:themeColor="text1"/>
+          <w:sz w:val="26"/>
+          <w:szCs w:val="26"/>
+        </w:rPr>
+        <w:t xml:space="preserve"> </w:t>
+      </w:r>
+      <w:proofErr w:type="spellStart"/>
+      <w:r>
+        <w:rPr>
+          <w:rFonts w:ascii="Times New Roman" w:hAnsi="Times New Roman" w:cs="Times New Roman"/>
+          <w:color w:val="000000" w:themeColor="text1"/>
+          <w:sz w:val="26"/>
+          <w:szCs w:val="26"/>
+        </w:rPr>
+        <w:t>kiếm</w:t>
+      </w:r>
+      <w:proofErr w:type="spellEnd"/>
+      <w:r>
+        <w:rPr>
+          <w:rFonts w:ascii="Times New Roman" w:hAnsi="Times New Roman" w:cs="Times New Roman"/>
+          <w:color w:val="000000" w:themeColor="text1"/>
+          <w:sz w:val="26"/>
+          <w:szCs w:val="26"/>
+        </w:rPr>
+        <w:t xml:space="preserve"> </w:t>
+      </w:r>
+      <w:proofErr w:type="spellStart"/>
+      <w:r>
+        <w:rPr>
+          <w:rFonts w:ascii="Times New Roman" w:hAnsi="Times New Roman" w:cs="Times New Roman"/>
+          <w:color w:val="000000" w:themeColor="text1"/>
+          <w:sz w:val="26"/>
+          <w:szCs w:val="26"/>
+        </w:rPr>
+        <w:t>sinh</w:t>
+      </w:r>
+      <w:proofErr w:type="spellEnd"/>
+      <w:r>
+        <w:rPr>
+          <w:rFonts w:ascii="Times New Roman" w:hAnsi="Times New Roman" w:cs="Times New Roman"/>
+          <w:color w:val="000000" w:themeColor="text1"/>
+          <w:sz w:val="26"/>
+          <w:szCs w:val="26"/>
+        </w:rPr>
+        <w:t xml:space="preserve"> </w:t>
+      </w:r>
+      <w:proofErr w:type="spellStart"/>
+      <w:r>
+        <w:rPr>
+          <w:rFonts w:ascii="Times New Roman" w:hAnsi="Times New Roman" w:cs="Times New Roman"/>
+          <w:color w:val="000000" w:themeColor="text1"/>
+          <w:sz w:val="26"/>
+          <w:szCs w:val="26"/>
+        </w:rPr>
+        <w:t>viên</w:t>
+      </w:r>
+      <w:proofErr w:type="spellEnd"/>
+      <w:r>
+        <w:rPr>
+          <w:rFonts w:ascii="Times New Roman" w:hAnsi="Times New Roman" w:cs="Times New Roman"/>
+          <w:color w:val="000000" w:themeColor="text1"/>
+          <w:sz w:val="26"/>
+          <w:szCs w:val="26"/>
+        </w:rPr>
+        <w:t xml:space="preserve"> </w:t>
+      </w:r>
+      <w:proofErr w:type="spellStart"/>
+      <w:r>
+        <w:rPr>
+          <w:rFonts w:ascii="Times New Roman" w:hAnsi="Times New Roman" w:cs="Times New Roman"/>
+          <w:color w:val="000000" w:themeColor="text1"/>
+          <w:sz w:val="26"/>
+          <w:szCs w:val="26"/>
+        </w:rPr>
+        <w:t>họ</w:t>
+      </w:r>
+      <w:proofErr w:type="spellEnd"/>
+      <w:r>
+        <w:rPr>
+          <w:rFonts w:ascii="Times New Roman" w:hAnsi="Times New Roman" w:cs="Times New Roman"/>
+          <w:color w:val="000000" w:themeColor="text1"/>
+          <w:sz w:val="26"/>
+          <w:szCs w:val="26"/>
+        </w:rPr>
+        <w:t xml:space="preserve"> Nguyễn</w:t>
       </w:r>
     </w:p>
     <w:p>
@@ -3785,8 +4166,39 @@
           <w:sz w:val="26"/>
           <w:szCs w:val="26"/>
         </w:rPr>
-        <w:t>Xem sinh viên</w:t>
-      </w:r>
+        <w:t xml:space="preserve">Xem </w:t>
+      </w:r>
+      <w:proofErr w:type="spellStart"/>
+      <w:r>
+        <w:rPr>
+          <w:rFonts w:ascii="Times New Roman" w:hAnsi="Times New Roman" w:cs="Times New Roman"/>
+          <w:color w:val="000000" w:themeColor="text1"/>
+          <w:sz w:val="26"/>
+          <w:szCs w:val="26"/>
+        </w:rPr>
+        <w:t>sinh</w:t>
+      </w:r>
+      <w:proofErr w:type="spellEnd"/>
+      <w:r>
+        <w:rPr>
+          <w:rFonts w:ascii="Times New Roman" w:hAnsi="Times New Roman" w:cs="Times New Roman"/>
+          <w:color w:val="000000" w:themeColor="text1"/>
+          <w:sz w:val="26"/>
+          <w:szCs w:val="26"/>
+        </w:rPr>
+        <w:t xml:space="preserve"> </w:t>
+      </w:r>
+      <w:proofErr w:type="spellStart"/>
+      <w:r>
+        <w:rPr>
+          <w:rFonts w:ascii="Times New Roman" w:hAnsi="Times New Roman" w:cs="Times New Roman"/>
+          <w:color w:val="000000" w:themeColor="text1"/>
+          <w:sz w:val="26"/>
+          <w:szCs w:val="26"/>
+        </w:rPr>
+        <w:t>viên</w:t>
+      </w:r>
+      <w:proofErr w:type="spellEnd"/>
     </w:p>
     <w:p>
       <w:pPr>
@@ -3859,6 +4271,7 @@
           <w:szCs w:val="26"/>
         </w:rPr>
       </w:pPr>
+      <w:proofErr w:type="spellStart"/>
       <w:r>
         <w:rPr>
           <w:rFonts w:ascii="Times New Roman" w:hAnsi="Times New Roman" w:cs="Times New Roman"/>
@@ -3866,7 +4279,77 @@
           <w:sz w:val="26"/>
           <w:szCs w:val="26"/>
         </w:rPr>
-        <w:t xml:space="preserve">Không tìm thấy Student có id = 999 </w:t>
+        <w:t>Không</w:t>
+      </w:r>
+      <w:proofErr w:type="spellEnd"/>
+      <w:r>
+        <w:rPr>
+          <w:rFonts w:ascii="Times New Roman" w:hAnsi="Times New Roman" w:cs="Times New Roman"/>
+          <w:color w:val="000000" w:themeColor="text1"/>
+          <w:sz w:val="26"/>
+          <w:szCs w:val="26"/>
+        </w:rPr>
+        <w:t xml:space="preserve"> </w:t>
+      </w:r>
+      <w:proofErr w:type="spellStart"/>
+      <w:r>
+        <w:rPr>
+          <w:rFonts w:ascii="Times New Roman" w:hAnsi="Times New Roman" w:cs="Times New Roman"/>
+          <w:color w:val="000000" w:themeColor="text1"/>
+          <w:sz w:val="26"/>
+          <w:szCs w:val="26"/>
+        </w:rPr>
+        <w:t>tìm</w:t>
+      </w:r>
+      <w:proofErr w:type="spellEnd"/>
+      <w:r>
+        <w:rPr>
+          <w:rFonts w:ascii="Times New Roman" w:hAnsi="Times New Roman" w:cs="Times New Roman"/>
+          <w:color w:val="000000" w:themeColor="text1"/>
+          <w:sz w:val="26"/>
+          <w:szCs w:val="26"/>
+        </w:rPr>
+        <w:t xml:space="preserve"> </w:t>
+      </w:r>
+      <w:proofErr w:type="spellStart"/>
+      <w:r>
+        <w:rPr>
+          <w:rFonts w:ascii="Times New Roman" w:hAnsi="Times New Roman" w:cs="Times New Roman"/>
+          <w:color w:val="000000" w:themeColor="text1"/>
+          <w:sz w:val="26"/>
+          <w:szCs w:val="26"/>
+        </w:rPr>
+        <w:t>thấy</w:t>
+      </w:r>
+      <w:proofErr w:type="spellEnd"/>
+      <w:r>
+        <w:rPr>
+          <w:rFonts w:ascii="Times New Roman" w:hAnsi="Times New Roman" w:cs="Times New Roman"/>
+          <w:color w:val="000000" w:themeColor="text1"/>
+          <w:sz w:val="26"/>
+          <w:szCs w:val="26"/>
+        </w:rPr>
+        <w:t xml:space="preserve"> Student </w:t>
+      </w:r>
+      <w:proofErr w:type="spellStart"/>
+      <w:r>
+        <w:rPr>
+          <w:rFonts w:ascii="Times New Roman" w:hAnsi="Times New Roman" w:cs="Times New Roman"/>
+          <w:color w:val="000000" w:themeColor="text1"/>
+          <w:sz w:val="26"/>
+          <w:szCs w:val="26"/>
+        </w:rPr>
+        <w:t>có</w:t>
+      </w:r>
+      <w:proofErr w:type="spellEnd"/>
+      <w:r>
+        <w:rPr>
+          <w:rFonts w:ascii="Times New Roman" w:hAnsi="Times New Roman" w:cs="Times New Roman"/>
+          <w:color w:val="000000" w:themeColor="text1"/>
+          <w:sz w:val="26"/>
+          <w:szCs w:val="26"/>
+        </w:rPr>
+        <w:t xml:space="preserve"> id = 999 </w:t>
       </w:r>
     </w:p>
     <w:p>
@@ -4188,8 +4671,9 @@
           <w:sz w:val="26"/>
           <w:szCs w:val="26"/>
         </w:rPr>
-        <w:t>n th</w:t>
-      </w:r>
+        <w:t xml:space="preserve">n </w:t>
+      </w:r>
+      <w:proofErr w:type="spellStart"/>
       <w:r>
         <w:rPr>
           <w:rFonts w:ascii="Times New Roman" w:hAnsi="Times New Roman" w:cs="Times New Roman"/>
@@ -4197,7 +4681,7 @@
           <w:sz w:val="26"/>
           <w:szCs w:val="26"/>
         </w:rPr>
-        <w:t>ị</w:t>
+        <w:t>th</w:t>
       </w:r>
       <w:r>
         <w:rPr>
@@ -4206,8 +4690,9 @@
           <w:sz w:val="26"/>
           <w:szCs w:val="26"/>
         </w:rPr>
-        <w:t xml:space="preserve"> đúng ti</w:t>
-      </w:r>
+        <w:t>ị</w:t>
+      </w:r>
+      <w:proofErr w:type="spellEnd"/>
       <w:r>
         <w:rPr>
           <w:rFonts w:ascii="Times New Roman" w:hAnsi="Times New Roman" w:cs="Times New Roman"/>
@@ -4215,8 +4700,9 @@
           <w:sz w:val="26"/>
           <w:szCs w:val="26"/>
         </w:rPr>
-        <w:t>ế</w:t>
-      </w:r>
+        <w:t xml:space="preserve"> </w:t>
+      </w:r>
+      <w:proofErr w:type="spellStart"/>
       <w:r>
         <w:rPr>
           <w:rFonts w:ascii="Times New Roman" w:hAnsi="Times New Roman" w:cs="Times New Roman"/>
@@ -4224,7 +4710,55 @@
           <w:sz w:val="26"/>
           <w:szCs w:val="26"/>
         </w:rPr>
-        <w:t>ng Vi</w:t>
+        <w:t>đúng</w:t>
+      </w:r>
+      <w:proofErr w:type="spellEnd"/>
+      <w:r>
+        <w:rPr>
+          <w:rFonts w:ascii="Times New Roman" w:hAnsi="Times New Roman" w:cs="Times New Roman"/>
+          <w:color w:val="000000" w:themeColor="text1"/>
+          <w:sz w:val="26"/>
+          <w:szCs w:val="26"/>
+        </w:rPr>
+        <w:t xml:space="preserve"> </w:t>
+      </w:r>
+      <w:proofErr w:type="spellStart"/>
+      <w:r>
+        <w:rPr>
+          <w:rFonts w:ascii="Times New Roman" w:hAnsi="Times New Roman" w:cs="Times New Roman"/>
+          <w:color w:val="000000" w:themeColor="text1"/>
+          <w:sz w:val="26"/>
+          <w:szCs w:val="26"/>
+        </w:rPr>
+        <w:t>ti</w:t>
+      </w:r>
+      <w:r>
+        <w:rPr>
+          <w:rFonts w:ascii="Times New Roman" w:hAnsi="Times New Roman" w:cs="Times New Roman"/>
+          <w:color w:val="000000" w:themeColor="text1"/>
+          <w:sz w:val="26"/>
+          <w:szCs w:val="26"/>
+        </w:rPr>
+        <w:t>ế</w:t>
+      </w:r>
+      <w:r>
+        <w:rPr>
+          <w:rFonts w:ascii="Times New Roman" w:hAnsi="Times New Roman" w:cs="Times New Roman"/>
+          <w:color w:val="000000" w:themeColor="text1"/>
+          <w:sz w:val="26"/>
+          <w:szCs w:val="26"/>
+        </w:rPr>
+        <w:t>ng</w:t>
+      </w:r>
+      <w:proofErr w:type="spellEnd"/>
+      <w:r>
+        <w:rPr>
+          <w:rFonts w:ascii="Times New Roman" w:hAnsi="Times New Roman" w:cs="Times New Roman"/>
+          <w:color w:val="000000" w:themeColor="text1"/>
+          <w:sz w:val="26"/>
+          <w:szCs w:val="26"/>
+        </w:rPr>
+        <w:t xml:space="preserve"> Vi</w:t>
       </w:r>
       <w:r>
         <w:rPr>

</xml_diff>